<commit_message>
Progress Update -- Working initial maintenance and upgrade plan.
 On branch working
 Changes to be committed:
	modified:   DIY_Hotspot/Maintenance_Plan_and_Log.docx
</commit_message>
<xml_diff>
--- a/DIY_Hotspot/Maintenance_Plan_and_Log.docx
+++ b/DIY_Hotspot/Maintenance_Plan_and_Log.docx
@@ -119,11 +119,126 @@
         <w:pStyle w:val="ListParagraph"/>
         <w:numPr>
           <w:ilvl w:val="0"/>
-          <w:numId w:val="3"/>
+          <w:numId w:val="4"/>
         </w:numPr>
       </w:pPr>
       <w:r>
         <w:t>Reboot and Test</w:t>
+      </w:r>
+    </w:p>
+    <w:p>
+      <w:pPr>
+        <w:pStyle w:val="ListParagraph"/>
+        <w:numPr>
+          <w:ilvl w:val="0"/>
+          <w:numId w:val="4"/>
+        </w:numPr>
+      </w:pPr>
+      <w:r>
+        <w:t>Image SD Card</w:t>
+      </w:r>
+    </w:p>
+    <w:p>
+      <w:pPr>
+        <w:pStyle w:val="ListParagraph"/>
+        <w:numPr>
+          <w:ilvl w:val="0"/>
+          <w:numId w:val="5"/>
+        </w:numPr>
+      </w:pPr>
+      <w:r>
+        <w:t>Manual Update from Admin</w:t>
+      </w:r>
+    </w:p>
+    <w:p>
+      <w:pPr>
+        <w:pStyle w:val="ListParagraph"/>
+        <w:numPr>
+          <w:ilvl w:val="0"/>
+          <w:numId w:val="6"/>
+        </w:numPr>
+      </w:pPr>
+      <w:r>
+        <w:t>Reboot and Test</w:t>
+      </w:r>
+    </w:p>
+    <w:p>
+      <w:pPr>
+        <w:pStyle w:val="ListParagraph"/>
+        <w:numPr>
+          <w:ilvl w:val="0"/>
+          <w:numId w:val="7"/>
+        </w:numPr>
+      </w:pPr>
+      <w:r>
+        <w:t>Manual Update via SSH</w:t>
+      </w:r>
+    </w:p>
+    <w:p>
+      <w:pPr>
+        <w:pStyle w:val="ListParagraph"/>
+        <w:numPr>
+          <w:ilvl w:val="0"/>
+          <w:numId w:val="7"/>
+        </w:numPr>
+      </w:pPr>
+      <w:proofErr w:type="spellStart"/>
+      <w:r>
+        <w:t>sudo</w:t>
+      </w:r>
+      <w:proofErr w:type="spellEnd"/>
+      <w:r>
+        <w:t xml:space="preserve"> </w:t>
+      </w:r>
+      <w:proofErr w:type="spellStart"/>
+      <w:r>
+        <w:t>pistar</w:t>
+      </w:r>
+      <w:proofErr w:type="spellEnd"/>
+      <w:r>
+        <w:t>-update</w:t>
+      </w:r>
+    </w:p>
+    <w:p>
+      <w:pPr>
+        <w:pStyle w:val="ListParagraph"/>
+        <w:numPr>
+          <w:ilvl w:val="0"/>
+          <w:numId w:val="7"/>
+        </w:numPr>
+      </w:pPr>
+      <w:proofErr w:type="spellStart"/>
+      <w:r>
+        <w:t>sudo</w:t>
+      </w:r>
+      <w:proofErr w:type="spellEnd"/>
+      <w:r>
+        <w:t xml:space="preserve"> </w:t>
+      </w:r>
+      <w:proofErr w:type="spellStart"/>
+      <w:r>
+        <w:t>pistar</w:t>
+      </w:r>
+      <w:proofErr w:type="spellEnd"/>
+      <w:r>
+        <w:t>-upgrade</w:t>
+      </w:r>
+    </w:p>
+    <w:p>
+      <w:pPr>
+        <w:pStyle w:val="ListParagraph"/>
+        <w:numPr>
+          <w:ilvl w:val="0"/>
+          <w:numId w:val="7"/>
+        </w:numPr>
+      </w:pPr>
+      <w:proofErr w:type="spellStart"/>
+      <w:r>
+        <w:t>sudo</w:t>
+      </w:r>
+      <w:proofErr w:type="spellEnd"/>
+      <w:r>
+        <w:t xml:space="preserve"> reboot</w:t>
       </w:r>
     </w:p>
     <w:p>
@@ -135,7 +250,7 @@
         </w:numPr>
       </w:pPr>
       <w:r>
-        <w:t>Image SD Card</w:t>
+        <w:t>Test</w:t>
       </w:r>
     </w:p>
     <w:p>
@@ -147,7 +262,7 @@
         </w:numPr>
       </w:pPr>
       <w:r>
-        <w:t>Manual Update from Admin</w:t>
+        <w:t>Second Manual Update Via SSH</w:t>
       </w:r>
     </w:p>
     <w:p>
@@ -158,8 +273,13 @@
           <w:numId w:val="3"/>
         </w:numPr>
       </w:pPr>
-      <w:r>
-        <w:t>Reboot and Test</w:t>
+      <w:proofErr w:type="spellStart"/>
+      <w:r>
+        <w:t>sudo</w:t>
+      </w:r>
+      <w:proofErr w:type="spellEnd"/>
+      <w:r>
+        <w:t xml:space="preserve"> apt update</w:t>
       </w:r>
     </w:p>
     <w:p>
@@ -170,8 +290,13 @@
           <w:numId w:val="3"/>
         </w:numPr>
       </w:pPr>
-      <w:r>
-        <w:t>Manual Update via SSH</w:t>
+      <w:proofErr w:type="spellStart"/>
+      <w:r>
+        <w:t>sudo</w:t>
+      </w:r>
+      <w:proofErr w:type="spellEnd"/>
+      <w:r>
+        <w:t xml:space="preserve"> apt upgrade</w:t>
       </w:r>
     </w:p>
     <w:p>
@@ -262,132 +387,52 @@
         </w:numPr>
       </w:pPr>
       <w:r>
-        <w:t>Second Manual Update Via SSH</w:t>
-      </w:r>
-    </w:p>
-    <w:p>
-      <w:pPr>
-        <w:pStyle w:val="ListParagraph"/>
-        <w:numPr>
-          <w:ilvl w:val="0"/>
-          <w:numId w:val="3"/>
-        </w:numPr>
-      </w:pPr>
-      <w:proofErr w:type="spellStart"/>
-      <w:r>
-        <w:t>sudo</w:t>
-      </w:r>
-      <w:proofErr w:type="spellEnd"/>
-      <w:r>
-        <w:t xml:space="preserve"> apt update</w:t>
-      </w:r>
-    </w:p>
-    <w:p>
-      <w:pPr>
-        <w:pStyle w:val="ListParagraph"/>
-        <w:numPr>
-          <w:ilvl w:val="0"/>
-          <w:numId w:val="3"/>
-        </w:numPr>
-      </w:pPr>
-      <w:proofErr w:type="spellStart"/>
-      <w:r>
-        <w:t>sudo</w:t>
-      </w:r>
-      <w:proofErr w:type="spellEnd"/>
-      <w:r>
-        <w:t xml:space="preserve"> apt upgrade</w:t>
-      </w:r>
-    </w:p>
-    <w:p>
-      <w:pPr>
-        <w:pStyle w:val="ListParagraph"/>
-        <w:numPr>
-          <w:ilvl w:val="0"/>
-          <w:numId w:val="3"/>
-        </w:numPr>
-      </w:pPr>
-      <w:proofErr w:type="spellStart"/>
-      <w:r>
-        <w:t>sudo</w:t>
-      </w:r>
-      <w:proofErr w:type="spellEnd"/>
-      <w:r>
-        <w:t xml:space="preserve"> </w:t>
-      </w:r>
-      <w:proofErr w:type="spellStart"/>
-      <w:r>
-        <w:t>pistar</w:t>
-      </w:r>
-      <w:proofErr w:type="spellEnd"/>
-      <w:r>
-        <w:t>-update</w:t>
-      </w:r>
-    </w:p>
-    <w:p>
-      <w:pPr>
-        <w:pStyle w:val="ListParagraph"/>
-        <w:numPr>
-          <w:ilvl w:val="0"/>
-          <w:numId w:val="3"/>
-        </w:numPr>
-      </w:pPr>
-      <w:proofErr w:type="spellStart"/>
-      <w:r>
-        <w:t>sudo</w:t>
-      </w:r>
-      <w:proofErr w:type="spellEnd"/>
-      <w:r>
-        <w:t xml:space="preserve"> </w:t>
-      </w:r>
-      <w:proofErr w:type="spellStart"/>
-      <w:r>
-        <w:t>pistar</w:t>
-      </w:r>
-      <w:proofErr w:type="spellEnd"/>
-      <w:r>
-        <w:t>-upgrade</w:t>
-      </w:r>
-    </w:p>
-    <w:p>
-      <w:pPr>
-        <w:pStyle w:val="ListParagraph"/>
-        <w:numPr>
-          <w:ilvl w:val="0"/>
-          <w:numId w:val="3"/>
-        </w:numPr>
-      </w:pPr>
-      <w:proofErr w:type="spellStart"/>
-      <w:r>
-        <w:t>sudo</w:t>
-      </w:r>
-      <w:proofErr w:type="spellEnd"/>
-      <w:r>
-        <w:t xml:space="preserve"> reboot</w:t>
-      </w:r>
-    </w:p>
-    <w:p>
-      <w:pPr>
-        <w:pStyle w:val="ListParagraph"/>
-        <w:numPr>
-          <w:ilvl w:val="0"/>
-          <w:numId w:val="3"/>
-        </w:numPr>
-      </w:pPr>
-      <w:r>
-        <w:t>Test</w:t>
-      </w:r>
-    </w:p>
-    <w:p>
-      <w:pPr>
-        <w:pStyle w:val="ListParagraph"/>
-        <w:numPr>
-          <w:ilvl w:val="0"/>
-          <w:numId w:val="3"/>
-        </w:numPr>
-      </w:pPr>
-      <w:r>
         <w:t>New Image</w:t>
+      </w:r>
+    </w:p>
+    <w:p/>
+    <w:p/>
+    <w:p>
+      <w:r>
+        <w:rPr>
+          <w:noProof/>
+        </w:rPr>
+        <w:lastRenderedPageBreak/>
+        <w:drawing>
+          <wp:inline distT="0" distB="0" distL="0" distR="0" wp14:anchorId="36FDC998" wp14:editId="341C500B">
+            <wp:extent cx="5943600" cy="4606290"/>
+            <wp:effectExtent l="0" t="0" r="0" b="3810"/>
+            <wp:docPr id="420767879" name="Picture 1" descr="A screenshot of a computer program&#10;&#10;AI-generated content may be incorrect."/>
+            <wp:cNvGraphicFramePr>
+              <a:graphicFrameLocks xmlns:a="http://schemas.openxmlformats.org/drawingml/2006/main" noChangeAspect="1"/>
+            </wp:cNvGraphicFramePr>
+            <a:graphic xmlns:a="http://schemas.openxmlformats.org/drawingml/2006/main">
+              <a:graphicData uri="http://schemas.openxmlformats.org/drawingml/2006/picture">
+                <pic:pic xmlns:pic="http://schemas.openxmlformats.org/drawingml/2006/picture">
+                  <pic:nvPicPr>
+                    <pic:cNvPr id="420767879" name="Picture 1" descr="A screenshot of a computer program&#10;&#10;AI-generated content may be incorrect."/>
+                    <pic:cNvPicPr/>
+                  </pic:nvPicPr>
+                  <pic:blipFill>
+                    <a:blip r:embed="rId5"/>
+                    <a:stretch>
+                      <a:fillRect/>
+                    </a:stretch>
+                  </pic:blipFill>
+                  <pic:spPr>
+                    <a:xfrm>
+                      <a:off x="0" y="0"/>
+                      <a:ext cx="5943600" cy="4606290"/>
+                    </a:xfrm>
+                    <a:prstGeom prst="rect">
+                      <a:avLst/>
+                    </a:prstGeom>
+                  </pic:spPr>
+                </pic:pic>
+              </a:graphicData>
+            </a:graphic>
+          </wp:inline>
+        </w:drawing>
       </w:r>
     </w:p>
     <w:sectPr>
@@ -403,6 +448,119 @@
 <file path=word/numbering.xml><?xml version="1.0" encoding="utf-8"?>
 <w:numbering xmlns:wpc="http://schemas.microsoft.com/office/word/2010/wordprocessingCanvas" xmlns:cx="http://schemas.microsoft.com/office/drawing/2014/chartex" xmlns:cx1="http://schemas.microsoft.com/office/drawing/2015/9/8/chartex" xmlns:cx2="http://schemas.microsoft.com/office/drawing/2015/10/21/chartex" xmlns:cx3="http://schemas.microsoft.com/office/drawing/2016/5/9/chartex" xmlns:cx4="http://schemas.microsoft.com/office/drawing/2016/5/10/chartex" xmlns:cx5="http://schemas.microsoft.com/office/drawing/2016/5/11/chartex" xmlns:cx6="http://schemas.microsoft.com/office/drawing/2016/5/12/chartex" xmlns:cx7="http://schemas.microsoft.com/office/drawing/2016/5/13/chartex" xmlns:cx8="http://schemas.microsoft.com/office/drawing/2016/5/14/chartex" xmlns:mc="http://schemas.openxmlformats.org/markup-compatibility/2006" xmlns:aink="http://schemas.microsoft.com/office/drawing/2016/ink" xmlns:am3d="http://schemas.microsoft.com/office/drawing/2017/model3d" xmlns:o="urn:schemas-microsoft-com:office:office" xmlns:oel="http://schemas.microsoft.com/office/2019/extlst" xmlns:r="http://schemas.openxmlformats.org/officeDocument/2006/relationships" xmlns:m="http://schemas.openxmlformats.org/officeDocument/2006/math" xmlns:v="urn:schemas-microsoft-com:vml" xmlns:wp14="http://schemas.microsoft.com/office/word/2010/wordprocessingDrawing" xmlns:wp="http://schemas.openxmlformats.org/drawingml/2006/wordprocessingDrawing" xmlns:w10="urn:schemas-microsoft-com:office:word" xmlns:w="http://schemas.openxmlformats.org/wordprocessingml/2006/main" xmlns:w14="http://schemas.microsoft.com/office/word/2010/wordml" xmlns:w15="http://schemas.microsoft.com/office/word/2012/wordml" xmlns:w16cex="http://schemas.microsoft.com/office/word/2018/wordml/cex" xmlns:w16cid="http://schemas.microsoft.com/office/word/2016/wordml/cid" xmlns:w16="http://schemas.microsoft.com/office/word/2018/wordml" xmlns:w16du="http://schemas.microsoft.com/office/word/2023/wordml/word16du" xmlns:w16sdtdh="http://schemas.microsoft.com/office/word/2020/wordml/sdtdatahash" xmlns:w16sdtfl="http://schemas.microsoft.com/office/word/2024/wordml/sdtformatlock" xmlns:w16se="http://schemas.microsoft.com/office/word/2015/wordml/symex" xmlns:wpg="http://schemas.microsoft.com/office/word/2010/wordprocessingGroup" xmlns:wpi="http://schemas.microsoft.com/office/word/2010/wordprocessingInk" xmlns:wne="http://schemas.microsoft.com/office/word/2006/wordml" xmlns:wps="http://schemas.microsoft.com/office/word/2010/wordprocessingShape" mc:Ignorable="w14 w15 w16se w16cid w16 w16cex w16sdtdh w16sdtfl w16du wp14">
   <w:abstractNum w:abstractNumId="0" w15:restartNumberingAfterBreak="0">
+    <w:nsid w:val="00BB3F7B"/>
+    <w:multiLevelType w:val="hybridMultilevel"/>
+    <w:tmpl w:val="81C834C2"/>
+    <w:lvl w:ilvl="0" w:tplc="0409000D">
+      <w:start w:val="1"/>
+      <w:numFmt w:val="bullet"/>
+      <w:lvlText w:val=""/>
+      <w:lvlJc w:val="left"/>
+      <w:pPr>
+        <w:ind w:left="720" w:hanging="360"/>
+      </w:pPr>
+      <w:rPr>
+        <w:rFonts w:ascii="Wingdings" w:hAnsi="Wingdings" w:hint="default"/>
+      </w:rPr>
+    </w:lvl>
+    <w:lvl w:ilvl="1" w:tplc="FFFFFFFF" w:tentative="1">
+      <w:start w:val="1"/>
+      <w:numFmt w:val="bullet"/>
+      <w:lvlText w:val="o"/>
+      <w:lvlJc w:val="left"/>
+      <w:pPr>
+        <w:ind w:left="1440" w:hanging="360"/>
+      </w:pPr>
+      <w:rPr>
+        <w:rFonts w:ascii="Courier New" w:hAnsi="Courier New" w:cs="Courier New" w:hint="default"/>
+      </w:rPr>
+    </w:lvl>
+    <w:lvl w:ilvl="2" w:tplc="FFFFFFFF" w:tentative="1">
+      <w:start w:val="1"/>
+      <w:numFmt w:val="bullet"/>
+      <w:lvlText w:val=""/>
+      <w:lvlJc w:val="left"/>
+      <w:pPr>
+        <w:ind w:left="2160" w:hanging="360"/>
+      </w:pPr>
+      <w:rPr>
+        <w:rFonts w:ascii="Wingdings" w:hAnsi="Wingdings" w:hint="default"/>
+      </w:rPr>
+    </w:lvl>
+    <w:lvl w:ilvl="3" w:tplc="FFFFFFFF" w:tentative="1">
+      <w:start w:val="1"/>
+      <w:numFmt w:val="bullet"/>
+      <w:lvlText w:val=""/>
+      <w:lvlJc w:val="left"/>
+      <w:pPr>
+        <w:ind w:left="2880" w:hanging="360"/>
+      </w:pPr>
+      <w:rPr>
+        <w:rFonts w:ascii="Symbol" w:hAnsi="Symbol" w:hint="default"/>
+      </w:rPr>
+    </w:lvl>
+    <w:lvl w:ilvl="4" w:tplc="FFFFFFFF" w:tentative="1">
+      <w:start w:val="1"/>
+      <w:numFmt w:val="bullet"/>
+      <w:lvlText w:val="o"/>
+      <w:lvlJc w:val="left"/>
+      <w:pPr>
+        <w:ind w:left="3600" w:hanging="360"/>
+      </w:pPr>
+      <w:rPr>
+        <w:rFonts w:ascii="Courier New" w:hAnsi="Courier New" w:cs="Courier New" w:hint="default"/>
+      </w:rPr>
+    </w:lvl>
+    <w:lvl w:ilvl="5" w:tplc="FFFFFFFF" w:tentative="1">
+      <w:start w:val="1"/>
+      <w:numFmt w:val="bullet"/>
+      <w:lvlText w:val=""/>
+      <w:lvlJc w:val="left"/>
+      <w:pPr>
+        <w:ind w:left="4320" w:hanging="360"/>
+      </w:pPr>
+      <w:rPr>
+        <w:rFonts w:ascii="Wingdings" w:hAnsi="Wingdings" w:hint="default"/>
+      </w:rPr>
+    </w:lvl>
+    <w:lvl w:ilvl="6" w:tplc="FFFFFFFF" w:tentative="1">
+      <w:start w:val="1"/>
+      <w:numFmt w:val="bullet"/>
+      <w:lvlText w:val=""/>
+      <w:lvlJc w:val="left"/>
+      <w:pPr>
+        <w:ind w:left="5040" w:hanging="360"/>
+      </w:pPr>
+      <w:rPr>
+        <w:rFonts w:ascii="Symbol" w:hAnsi="Symbol" w:hint="default"/>
+      </w:rPr>
+    </w:lvl>
+    <w:lvl w:ilvl="7" w:tplc="FFFFFFFF" w:tentative="1">
+      <w:start w:val="1"/>
+      <w:numFmt w:val="bullet"/>
+      <w:lvlText w:val="o"/>
+      <w:lvlJc w:val="left"/>
+      <w:pPr>
+        <w:ind w:left="5760" w:hanging="360"/>
+      </w:pPr>
+      <w:rPr>
+        <w:rFonts w:ascii="Courier New" w:hAnsi="Courier New" w:cs="Courier New" w:hint="default"/>
+      </w:rPr>
+    </w:lvl>
+    <w:lvl w:ilvl="8" w:tplc="FFFFFFFF" w:tentative="1">
+      <w:start w:val="1"/>
+      <w:numFmt w:val="bullet"/>
+      <w:lvlText w:val=""/>
+      <w:lvlJc w:val="left"/>
+      <w:pPr>
+        <w:ind w:left="6480" w:hanging="360"/>
+      </w:pPr>
+      <w:rPr>
+        <w:rFonts w:ascii="Wingdings" w:hAnsi="Wingdings" w:hint="default"/>
+      </w:rPr>
+    </w:lvl>
+  </w:abstractNum>
+  <w:abstractNum w:abstractNumId="1" w15:restartNumberingAfterBreak="0">
     <w:nsid w:val="07672B7D"/>
     <w:multiLevelType w:val="hybridMultilevel"/>
     <w:tmpl w:val="2AB24F5A"/>
@@ -515,7 +673,346 @@
       </w:rPr>
     </w:lvl>
   </w:abstractNum>
-  <w:abstractNum w:abstractNumId="1" w15:restartNumberingAfterBreak="0">
+  <w:abstractNum w:abstractNumId="2" w15:restartNumberingAfterBreak="0">
+    <w:nsid w:val="3EFF0F13"/>
+    <w:multiLevelType w:val="hybridMultilevel"/>
+    <w:tmpl w:val="D3748A56"/>
+    <w:lvl w:ilvl="0" w:tplc="0409000D">
+      <w:start w:val="1"/>
+      <w:numFmt w:val="bullet"/>
+      <w:lvlText w:val=""/>
+      <w:lvlJc w:val="left"/>
+      <w:pPr>
+        <w:ind w:left="720" w:hanging="360"/>
+      </w:pPr>
+      <w:rPr>
+        <w:rFonts w:ascii="Wingdings" w:hAnsi="Wingdings" w:hint="default"/>
+      </w:rPr>
+    </w:lvl>
+    <w:lvl w:ilvl="1" w:tplc="FFFFFFFF" w:tentative="1">
+      <w:start w:val="1"/>
+      <w:numFmt w:val="bullet"/>
+      <w:lvlText w:val="o"/>
+      <w:lvlJc w:val="left"/>
+      <w:pPr>
+        <w:ind w:left="1440" w:hanging="360"/>
+      </w:pPr>
+      <w:rPr>
+        <w:rFonts w:ascii="Courier New" w:hAnsi="Courier New" w:cs="Courier New" w:hint="default"/>
+      </w:rPr>
+    </w:lvl>
+    <w:lvl w:ilvl="2" w:tplc="FFFFFFFF" w:tentative="1">
+      <w:start w:val="1"/>
+      <w:numFmt w:val="bullet"/>
+      <w:lvlText w:val=""/>
+      <w:lvlJc w:val="left"/>
+      <w:pPr>
+        <w:ind w:left="2160" w:hanging="360"/>
+      </w:pPr>
+      <w:rPr>
+        <w:rFonts w:ascii="Wingdings" w:hAnsi="Wingdings" w:hint="default"/>
+      </w:rPr>
+    </w:lvl>
+    <w:lvl w:ilvl="3" w:tplc="FFFFFFFF" w:tentative="1">
+      <w:start w:val="1"/>
+      <w:numFmt w:val="bullet"/>
+      <w:lvlText w:val=""/>
+      <w:lvlJc w:val="left"/>
+      <w:pPr>
+        <w:ind w:left="2880" w:hanging="360"/>
+      </w:pPr>
+      <w:rPr>
+        <w:rFonts w:ascii="Symbol" w:hAnsi="Symbol" w:hint="default"/>
+      </w:rPr>
+    </w:lvl>
+    <w:lvl w:ilvl="4" w:tplc="FFFFFFFF" w:tentative="1">
+      <w:start w:val="1"/>
+      <w:numFmt w:val="bullet"/>
+      <w:lvlText w:val="o"/>
+      <w:lvlJc w:val="left"/>
+      <w:pPr>
+        <w:ind w:left="3600" w:hanging="360"/>
+      </w:pPr>
+      <w:rPr>
+        <w:rFonts w:ascii="Courier New" w:hAnsi="Courier New" w:cs="Courier New" w:hint="default"/>
+      </w:rPr>
+    </w:lvl>
+    <w:lvl w:ilvl="5" w:tplc="FFFFFFFF" w:tentative="1">
+      <w:start w:val="1"/>
+      <w:numFmt w:val="bullet"/>
+      <w:lvlText w:val=""/>
+      <w:lvlJc w:val="left"/>
+      <w:pPr>
+        <w:ind w:left="4320" w:hanging="360"/>
+      </w:pPr>
+      <w:rPr>
+        <w:rFonts w:ascii="Wingdings" w:hAnsi="Wingdings" w:hint="default"/>
+      </w:rPr>
+    </w:lvl>
+    <w:lvl w:ilvl="6" w:tplc="FFFFFFFF" w:tentative="1">
+      <w:start w:val="1"/>
+      <w:numFmt w:val="bullet"/>
+      <w:lvlText w:val=""/>
+      <w:lvlJc w:val="left"/>
+      <w:pPr>
+        <w:ind w:left="5040" w:hanging="360"/>
+      </w:pPr>
+      <w:rPr>
+        <w:rFonts w:ascii="Symbol" w:hAnsi="Symbol" w:hint="default"/>
+      </w:rPr>
+    </w:lvl>
+    <w:lvl w:ilvl="7" w:tplc="FFFFFFFF" w:tentative="1">
+      <w:start w:val="1"/>
+      <w:numFmt w:val="bullet"/>
+      <w:lvlText w:val="o"/>
+      <w:lvlJc w:val="left"/>
+      <w:pPr>
+        <w:ind w:left="5760" w:hanging="360"/>
+      </w:pPr>
+      <w:rPr>
+        <w:rFonts w:ascii="Courier New" w:hAnsi="Courier New" w:cs="Courier New" w:hint="default"/>
+      </w:rPr>
+    </w:lvl>
+    <w:lvl w:ilvl="8" w:tplc="FFFFFFFF" w:tentative="1">
+      <w:start w:val="1"/>
+      <w:numFmt w:val="bullet"/>
+      <w:lvlText w:val=""/>
+      <w:lvlJc w:val="left"/>
+      <w:pPr>
+        <w:ind w:left="6480" w:hanging="360"/>
+      </w:pPr>
+      <w:rPr>
+        <w:rFonts w:ascii="Wingdings" w:hAnsi="Wingdings" w:hint="default"/>
+      </w:rPr>
+    </w:lvl>
+  </w:abstractNum>
+  <w:abstractNum w:abstractNumId="3" w15:restartNumberingAfterBreak="0">
+    <w:nsid w:val="559F02B4"/>
+    <w:multiLevelType w:val="hybridMultilevel"/>
+    <w:tmpl w:val="36B8A40A"/>
+    <w:lvl w:ilvl="0" w:tplc="0409000D">
+      <w:start w:val="1"/>
+      <w:numFmt w:val="bullet"/>
+      <w:lvlText w:val=""/>
+      <w:lvlJc w:val="left"/>
+      <w:pPr>
+        <w:ind w:left="720" w:hanging="360"/>
+      </w:pPr>
+      <w:rPr>
+        <w:rFonts w:ascii="Wingdings" w:hAnsi="Wingdings" w:hint="default"/>
+      </w:rPr>
+    </w:lvl>
+    <w:lvl w:ilvl="1" w:tplc="FFFFFFFF" w:tentative="1">
+      <w:start w:val="1"/>
+      <w:numFmt w:val="bullet"/>
+      <w:lvlText w:val="o"/>
+      <w:lvlJc w:val="left"/>
+      <w:pPr>
+        <w:ind w:left="1440" w:hanging="360"/>
+      </w:pPr>
+      <w:rPr>
+        <w:rFonts w:ascii="Courier New" w:hAnsi="Courier New" w:cs="Courier New" w:hint="default"/>
+      </w:rPr>
+    </w:lvl>
+    <w:lvl w:ilvl="2" w:tplc="FFFFFFFF" w:tentative="1">
+      <w:start w:val="1"/>
+      <w:numFmt w:val="bullet"/>
+      <w:lvlText w:val=""/>
+      <w:lvlJc w:val="left"/>
+      <w:pPr>
+        <w:ind w:left="2160" w:hanging="360"/>
+      </w:pPr>
+      <w:rPr>
+        <w:rFonts w:ascii="Wingdings" w:hAnsi="Wingdings" w:hint="default"/>
+      </w:rPr>
+    </w:lvl>
+    <w:lvl w:ilvl="3" w:tplc="FFFFFFFF" w:tentative="1">
+      <w:start w:val="1"/>
+      <w:numFmt w:val="bullet"/>
+      <w:lvlText w:val=""/>
+      <w:lvlJc w:val="left"/>
+      <w:pPr>
+        <w:ind w:left="2880" w:hanging="360"/>
+      </w:pPr>
+      <w:rPr>
+        <w:rFonts w:ascii="Symbol" w:hAnsi="Symbol" w:hint="default"/>
+      </w:rPr>
+    </w:lvl>
+    <w:lvl w:ilvl="4" w:tplc="FFFFFFFF" w:tentative="1">
+      <w:start w:val="1"/>
+      <w:numFmt w:val="bullet"/>
+      <w:lvlText w:val="o"/>
+      <w:lvlJc w:val="left"/>
+      <w:pPr>
+        <w:ind w:left="3600" w:hanging="360"/>
+      </w:pPr>
+      <w:rPr>
+        <w:rFonts w:ascii="Courier New" w:hAnsi="Courier New" w:cs="Courier New" w:hint="default"/>
+      </w:rPr>
+    </w:lvl>
+    <w:lvl w:ilvl="5" w:tplc="FFFFFFFF" w:tentative="1">
+      <w:start w:val="1"/>
+      <w:numFmt w:val="bullet"/>
+      <w:lvlText w:val=""/>
+      <w:lvlJc w:val="left"/>
+      <w:pPr>
+        <w:ind w:left="4320" w:hanging="360"/>
+      </w:pPr>
+      <w:rPr>
+        <w:rFonts w:ascii="Wingdings" w:hAnsi="Wingdings" w:hint="default"/>
+      </w:rPr>
+    </w:lvl>
+    <w:lvl w:ilvl="6" w:tplc="FFFFFFFF" w:tentative="1">
+      <w:start w:val="1"/>
+      <w:numFmt w:val="bullet"/>
+      <w:lvlText w:val=""/>
+      <w:lvlJc w:val="left"/>
+      <w:pPr>
+        <w:ind w:left="5040" w:hanging="360"/>
+      </w:pPr>
+      <w:rPr>
+        <w:rFonts w:ascii="Symbol" w:hAnsi="Symbol" w:hint="default"/>
+      </w:rPr>
+    </w:lvl>
+    <w:lvl w:ilvl="7" w:tplc="FFFFFFFF" w:tentative="1">
+      <w:start w:val="1"/>
+      <w:numFmt w:val="bullet"/>
+      <w:lvlText w:val="o"/>
+      <w:lvlJc w:val="left"/>
+      <w:pPr>
+        <w:ind w:left="5760" w:hanging="360"/>
+      </w:pPr>
+      <w:rPr>
+        <w:rFonts w:ascii="Courier New" w:hAnsi="Courier New" w:cs="Courier New" w:hint="default"/>
+      </w:rPr>
+    </w:lvl>
+    <w:lvl w:ilvl="8" w:tplc="FFFFFFFF" w:tentative="1">
+      <w:start w:val="1"/>
+      <w:numFmt w:val="bullet"/>
+      <w:lvlText w:val=""/>
+      <w:lvlJc w:val="left"/>
+      <w:pPr>
+        <w:ind w:left="6480" w:hanging="360"/>
+      </w:pPr>
+      <w:rPr>
+        <w:rFonts w:ascii="Wingdings" w:hAnsi="Wingdings" w:hint="default"/>
+      </w:rPr>
+    </w:lvl>
+  </w:abstractNum>
+  <w:abstractNum w:abstractNumId="4" w15:restartNumberingAfterBreak="0">
+    <w:nsid w:val="6B474D68"/>
+    <w:multiLevelType w:val="hybridMultilevel"/>
+    <w:tmpl w:val="3A1239B2"/>
+    <w:lvl w:ilvl="0" w:tplc="0409000D">
+      <w:start w:val="1"/>
+      <w:numFmt w:val="bullet"/>
+      <w:lvlText w:val=""/>
+      <w:lvlJc w:val="left"/>
+      <w:pPr>
+        <w:ind w:left="720" w:hanging="360"/>
+      </w:pPr>
+      <w:rPr>
+        <w:rFonts w:ascii="Wingdings" w:hAnsi="Wingdings" w:hint="default"/>
+      </w:rPr>
+    </w:lvl>
+    <w:lvl w:ilvl="1" w:tplc="FFFFFFFF" w:tentative="1">
+      <w:start w:val="1"/>
+      <w:numFmt w:val="bullet"/>
+      <w:lvlText w:val="o"/>
+      <w:lvlJc w:val="left"/>
+      <w:pPr>
+        <w:ind w:left="1440" w:hanging="360"/>
+      </w:pPr>
+      <w:rPr>
+        <w:rFonts w:ascii="Courier New" w:hAnsi="Courier New" w:cs="Courier New" w:hint="default"/>
+      </w:rPr>
+    </w:lvl>
+    <w:lvl w:ilvl="2" w:tplc="FFFFFFFF" w:tentative="1">
+      <w:start w:val="1"/>
+      <w:numFmt w:val="bullet"/>
+      <w:lvlText w:val=""/>
+      <w:lvlJc w:val="left"/>
+      <w:pPr>
+        <w:ind w:left="2160" w:hanging="360"/>
+      </w:pPr>
+      <w:rPr>
+        <w:rFonts w:ascii="Wingdings" w:hAnsi="Wingdings" w:hint="default"/>
+      </w:rPr>
+    </w:lvl>
+    <w:lvl w:ilvl="3" w:tplc="FFFFFFFF" w:tentative="1">
+      <w:start w:val="1"/>
+      <w:numFmt w:val="bullet"/>
+      <w:lvlText w:val=""/>
+      <w:lvlJc w:val="left"/>
+      <w:pPr>
+        <w:ind w:left="2880" w:hanging="360"/>
+      </w:pPr>
+      <w:rPr>
+        <w:rFonts w:ascii="Symbol" w:hAnsi="Symbol" w:hint="default"/>
+      </w:rPr>
+    </w:lvl>
+    <w:lvl w:ilvl="4" w:tplc="FFFFFFFF" w:tentative="1">
+      <w:start w:val="1"/>
+      <w:numFmt w:val="bullet"/>
+      <w:lvlText w:val="o"/>
+      <w:lvlJc w:val="left"/>
+      <w:pPr>
+        <w:ind w:left="3600" w:hanging="360"/>
+      </w:pPr>
+      <w:rPr>
+        <w:rFonts w:ascii="Courier New" w:hAnsi="Courier New" w:cs="Courier New" w:hint="default"/>
+      </w:rPr>
+    </w:lvl>
+    <w:lvl w:ilvl="5" w:tplc="FFFFFFFF" w:tentative="1">
+      <w:start w:val="1"/>
+      <w:numFmt w:val="bullet"/>
+      <w:lvlText w:val=""/>
+      <w:lvlJc w:val="left"/>
+      <w:pPr>
+        <w:ind w:left="4320" w:hanging="360"/>
+      </w:pPr>
+      <w:rPr>
+        <w:rFonts w:ascii="Wingdings" w:hAnsi="Wingdings" w:hint="default"/>
+      </w:rPr>
+    </w:lvl>
+    <w:lvl w:ilvl="6" w:tplc="FFFFFFFF" w:tentative="1">
+      <w:start w:val="1"/>
+      <w:numFmt w:val="bullet"/>
+      <w:lvlText w:val=""/>
+      <w:lvlJc w:val="left"/>
+      <w:pPr>
+        <w:ind w:left="5040" w:hanging="360"/>
+      </w:pPr>
+      <w:rPr>
+        <w:rFonts w:ascii="Symbol" w:hAnsi="Symbol" w:hint="default"/>
+      </w:rPr>
+    </w:lvl>
+    <w:lvl w:ilvl="7" w:tplc="FFFFFFFF" w:tentative="1">
+      <w:start w:val="1"/>
+      <w:numFmt w:val="bullet"/>
+      <w:lvlText w:val="o"/>
+      <w:lvlJc w:val="left"/>
+      <w:pPr>
+        <w:ind w:left="5760" w:hanging="360"/>
+      </w:pPr>
+      <w:rPr>
+        <w:rFonts w:ascii="Courier New" w:hAnsi="Courier New" w:cs="Courier New" w:hint="default"/>
+      </w:rPr>
+    </w:lvl>
+    <w:lvl w:ilvl="8" w:tplc="FFFFFFFF" w:tentative="1">
+      <w:start w:val="1"/>
+      <w:numFmt w:val="bullet"/>
+      <w:lvlText w:val=""/>
+      <w:lvlJc w:val="left"/>
+      <w:pPr>
+        <w:ind w:left="6480" w:hanging="360"/>
+      </w:pPr>
+      <w:rPr>
+        <w:rFonts w:ascii="Wingdings" w:hAnsi="Wingdings" w:hint="default"/>
+      </w:rPr>
+    </w:lvl>
+  </w:abstractNum>
+  <w:abstractNum w:abstractNumId="5" w15:restartNumberingAfterBreak="0">
     <w:nsid w:val="6EB32A78"/>
     <w:multiLevelType w:val="hybridMultilevel"/>
     <w:tmpl w:val="EA2078A8"/>
@@ -628,7 +1125,7 @@
       </w:rPr>
     </w:lvl>
   </w:abstractNum>
-  <w:abstractNum w:abstractNumId="2" w15:restartNumberingAfterBreak="0">
+  <w:abstractNum w:abstractNumId="6" w15:restartNumberingAfterBreak="0">
     <w:nsid w:val="6ED35D46"/>
     <w:multiLevelType w:val="hybridMultilevel"/>
     <w:tmpl w:val="3D2AF938"/>
@@ -742,13 +1239,25 @@
     </w:lvl>
   </w:abstractNum>
   <w:num w:numId="1" w16cid:durableId="508373524">
+    <w:abstractNumId w:val="1"/>
+  </w:num>
+  <w:num w:numId="2" w16cid:durableId="1990088338">
+    <w:abstractNumId w:val="5"/>
+  </w:num>
+  <w:num w:numId="3" w16cid:durableId="1079712558">
+    <w:abstractNumId w:val="6"/>
+  </w:num>
+  <w:num w:numId="4" w16cid:durableId="1317536291">
+    <w:abstractNumId w:val="4"/>
+  </w:num>
+  <w:num w:numId="5" w16cid:durableId="251398570">
+    <w:abstractNumId w:val="2"/>
+  </w:num>
+  <w:num w:numId="6" w16cid:durableId="73406082">
     <w:abstractNumId w:val="0"/>
   </w:num>
-  <w:num w:numId="2" w16cid:durableId="1990088338">
-    <w:abstractNumId w:val="1"/>
-  </w:num>
-  <w:num w:numId="3" w16cid:durableId="1079712558">
-    <w:abstractNumId w:val="2"/>
+  <w:num w:numId="7" w16cid:durableId="1718779239">
+    <w:abstractNumId w:val="3"/>
   </w:num>
 </w:numbering>
 </file>

</xml_diff>